<commit_message>
resume pdf download style change
</commit_message>
<xml_diff>
--- a/Amar_Abbas_Resume.docx
+++ b/Amar_Abbas_Resume.docx
@@ -41,7 +41,36 @@
         <w:spacing w:after="160" w:before="0"/>
         <w:jc w:val="left"/>
       </w:pPr>
-      <w:hyperlink w:history="1" r:id="rId2yu48adiwqnuwiv9p5xbr">
+      <w:r>
+        <w:rPr>
+          <w:b/>
+          <w:bCs/>
+          <w:sz w:val="20"/>
+          <w:szCs w:val="20"/>
+        </w:rPr>
+        <w:t xml:space="preserve">Portfolio: </w:t>
+      </w:r>
+      <w:hyperlink w:history="1" r:id="rIdfh0f7lsqcylkps9leeaml">
+        <w:r>
+          <w:rPr>
+            <w:rStyle w:val="Hyperlink"/>
+            <w:rFonts w:ascii="Calibri" w:cs="Calibri" w:eastAsia="Calibri" w:hAnsi="Calibri"/>
+            <w:color w:val="0284C7"/>
+            <w:sz w:val="20"/>
+            <w:szCs w:val="20"/>
+            <w:u w:val="single" w:color="0284C7"/>
+          </w:rPr>
+          <w:t xml:space="preserve">amar-abbas.vercel.app</w:t>
+        </w:r>
+      </w:hyperlink>
+      <w:r>
+        <w:rPr>
+          <w:sz w:val="20"/>
+          <w:szCs w:val="20"/>
+        </w:rPr>
+        <w:t xml:space="preserve"> | </w:t>
+      </w:r>
+      <w:hyperlink w:history="1" r:id="rIdafbdzavhlr4moadfn9l4u">
         <w:r>
           <w:rPr>
             <w:rStyle w:val="Hyperlink"/>
@@ -61,7 +90,7 @@
         </w:rPr>
         <w:t xml:space="preserve"> | +92 309 8915950 | </w:t>
       </w:r>
-      <w:hyperlink w:history="1" r:id="rIdc25is3xwwgyamhmjzqohn">
+      <w:hyperlink w:history="1" r:id="rIdrjw2dr61q7_quqjv43_l1">
         <w:r>
           <w:rPr>
             <w:rStyle w:val="Hyperlink"/>
@@ -81,7 +110,7 @@
         </w:rPr>
         <w:t xml:space="preserve"> | </w:t>
       </w:r>
-      <w:hyperlink w:history="1" r:id="rIdvk-rw4fofp9kiffk5gtzw">
+      <w:hyperlink w:history="1" r:id="rIdkxysszd4vxx99o6zm4k0a">
         <w:r>
           <w:rPr>
             <w:rStyle w:val="Hyperlink"/>

</xml_diff>